<commit_message>
Chapter 4 and 5
</commit_message>
<xml_diff>
--- a/docs/handouts/Ch03_Mechanisms_STUDENT.docx
+++ b/docs/handouts/Ch03_Mechanisms_STUDENT.docx
@@ -2441,6 +2441,90 @@
         </w:tc>
       </w:tr>
     </w:tbl>
+    <w:p>
+      <w:pPr>
+        <w:pBdr>
+          <w:bottom w:val="single" w:color="2E75B6" w:sz="6" w:space="2"/>
+        </w:pBdr>
+        <w:spacing w:after="70" w:before="200"/>
+      </w:pPr>
+      <w:r>
+        <w:rPr>
+          <w:b/>
+          <w:bCs/>
+          <w:i w:val="false"/>
+          <w:iCs w:val="false"/>
+          <w:color w:val="2E75B6"/>
+          <w:sz w:val="24"/>
+          <w:szCs w:val="24"/>
+        </w:rPr>
+        <w:t xml:space="preserve">Engineering Drawing</w:t>
+      </w:r>
+    </w:p>
+    <w:p>
+      <w:pPr>
+        <w:spacing w:after="40" w:before="120"/>
+        <w:jc w:val="center"/>
+      </w:pPr>
+      <w:r>
+        <w:drawing>
+          <wp:inline distT="0" distB="0" distL="0" distR="0">
+            <wp:extent cx="5334000" cy="2809875"/>
+            <wp:effectExtent t="0" r="0" b="0" l="0"/>
+            <wp:docPr id="1" name="" descr="" title=""/>
+            <wp:cNvGraphicFramePr>
+              <a:graphicFrameLocks xmlns:a="http://schemas.openxmlformats.org/drawingml/2006/main" noChangeAspect="1"/>
+            </wp:cNvGraphicFramePr>
+            <a:graphic xmlns:a="http://schemas.openxmlformats.org/drawingml/2006/main">
+              <a:graphicData uri="http://schemas.openxmlformats.org/drawingml/2006/picture">
+                <pic:pic xmlns:pic="http://schemas.openxmlformats.org/drawingml/2006/picture">
+                  <pic:nvPicPr>
+                    <pic:cNvPr id="0" name="" descr=""/>
+                    <pic:cNvPicPr>
+                      <a:picLocks noChangeAspect="1" noChangeArrowheads="1"/>
+                    </pic:cNvPicPr>
+                  </pic:nvPicPr>
+                  <pic:blipFill>
+                    <a:blip r:embed="rId7" cstate="none"/>
+                    <a:srcRect/>
+                    <a:stretch>
+                      <a:fillRect/>
+                    </a:stretch>
+                  </pic:blipFill>
+                  <pic:spPr bwMode="auto">
+                    <a:xfrm>
+                      <a:off x="0" y="0"/>
+                      <a:ext cx="5334000" cy="2809875"/>
+                    </a:xfrm>
+                    <a:prstGeom prst="rect">
+                      <a:avLst/>
+                    </a:prstGeom>
+                  </pic:spPr>
+                </pic:pic>
+              </a:graphicData>
+            </a:graphic>
+          </wp:inline>
+        </w:drawing>
+      </w:r>
+    </w:p>
+    <w:p>
+      <w:pPr>
+        <w:spacing w:after="140"/>
+        <w:jc w:val="center"/>
+      </w:pPr>
+      <w:r>
+        <w:rPr>
+          <w:b w:val="false"/>
+          <w:bCs w:val="false"/>
+          <w:i/>
+          <w:iCs/>
+          <w:color w:val="5B6470"/>
+          <w:sz w:val="17"/>
+          <w:szCs w:val="17"/>
+        </w:rPr>
+        <w:t xml:space="preserve">The 24T and 60T gears as a technical drawing. Because pitch Ø = teeth ÷ 24, the center distance is just the average of the two pitch radii: 1.75 inches.</w:t>
+      </w:r>
+    </w:p>
     <w:p>
       <w:pPr>
         <w:pBdr>

</xml_diff>